<commit_message>
docs(ass1): update assignment 1 answer sheet and pdf
</commit_message>
<xml_diff>
--- a/ass1/answer_sheet.docx
+++ b/ass1/answer_sheet.docx
@@ -66,6 +66,9 @@
         <w:jc w:val="center"/>
       </w:pPr>
       <w:r>
+        <w:rPr>
+          <w:noProof/>
+        </w:rPr>
         <w:drawing>
           <wp:inline distT="0" distB="0" distL="0" distR="0" wp14:anchorId="529C824C" wp14:editId="228DED46">
             <wp:extent cx="5943600" cy="551180"/>
@@ -441,7 +444,19 @@
           <w:rPr>
             <w:rFonts w:ascii="Cambria Math" w:hAnsi="Cambria Math"/>
           </w:rPr>
-          <m:t xml:space="preserve"> * C  * 2&gt;= 31536000</m:t>
+          <m:t xml:space="preserve"> * C  </m:t>
+        </m:r>
+        <m:r>
+          <w:rPr>
+            <w:rFonts w:ascii="Cambria Math" w:hAnsi="Cambria Math"/>
+          </w:rPr>
+          <m:t>/</m:t>
+        </m:r>
+        <m:r>
+          <w:rPr>
+            <w:rFonts w:ascii="Cambria Math" w:hAnsi="Cambria Math"/>
+          </w:rPr>
+          <m:t xml:space="preserve"> 2&gt;= 31536000</m:t>
         </m:r>
         <m:r>
           <m:rPr>
@@ -623,7 +638,19 @@
           <w:rPr>
             <w:rFonts w:ascii="Cambria Math" w:hAnsi="Cambria Math"/>
           </w:rPr>
-          <m:t xml:space="preserve"> * 0.000016 * 2&gt;= 31536000</m:t>
+          <m:t xml:space="preserve"> * 0.000016 </m:t>
+        </m:r>
+        <m:r>
+          <w:rPr>
+            <w:rFonts w:ascii="Cambria Math" w:hAnsi="Cambria Math"/>
+          </w:rPr>
+          <m:t>/</m:t>
+        </m:r>
+        <m:r>
+          <w:rPr>
+            <w:rFonts w:ascii="Cambria Math" w:hAnsi="Cambria Math"/>
+          </w:rPr>
+          <m:t xml:space="preserve"> 2&gt;= 31536000</m:t>
         </m:r>
       </m:oMath>
       <w:r>
@@ -707,7 +734,19 @@
           <w:rPr>
             <w:rFonts w:ascii="Cambria Math" w:hAnsi="Cambria Math"/>
           </w:rPr>
-          <m:t xml:space="preserve"> * 0.000006 * 2&gt;= 31536000</m:t>
+          <m:t xml:space="preserve"> * 0.000006 </m:t>
+        </m:r>
+        <m:r>
+          <w:rPr>
+            <w:rFonts w:ascii="Cambria Math" w:hAnsi="Cambria Math"/>
+          </w:rPr>
+          <m:t>/</m:t>
+        </m:r>
+        <m:r>
+          <w:rPr>
+            <w:rFonts w:ascii="Cambria Math" w:hAnsi="Cambria Math"/>
+          </w:rPr>
+          <m:t xml:space="preserve"> 2&gt;= 31536000</m:t>
         </m:r>
       </m:oMath>
       <w:r>
@@ -796,7 +835,19 @@
           <w:rPr>
             <w:rFonts w:ascii="Cambria Math" w:hAnsi="Cambria Math"/>
           </w:rPr>
-          <m:t xml:space="preserve"> * 0.382539 * 2&gt;= 31536000</m:t>
+          <m:t xml:space="preserve"> * 0.382539 </m:t>
+        </m:r>
+        <m:r>
+          <w:rPr>
+            <w:rFonts w:ascii="Cambria Math" w:hAnsi="Cambria Math"/>
+          </w:rPr>
+          <m:t>/</m:t>
+        </m:r>
+        <m:r>
+          <w:rPr>
+            <w:rFonts w:ascii="Cambria Math" w:hAnsi="Cambria Math"/>
+          </w:rPr>
+          <m:t xml:space="preserve"> 2&gt;= 31536000</m:t>
         </m:r>
       </m:oMath>
       <w:r>

</xml_diff>